<commit_message>
Security: update cryptography to 50.0.1 and refresh v1.0.0 baseline
</commit_message>
<xml_diff>
--- a/docs/VAPT_Sanitizer_v1.0.0_User_Guide_EN.docx
+++ b/docs/VAPT_Sanitizer_v1.0.0_User_Guide_EN.docx
@@ -138,7 +138,7 @@
           <w:sz w:val="17"/>
           <w:lang w:val="en-US" w:eastAsia="en-US"/>
         </w:rPr>
-        <w:t>SHA-256 stable ZIP</w:t>
+        <w:t>Release checksum</w:t>
       </w:r>
     </w:p>
     <w:p>
@@ -152,7 +152,7 @@
           <w:sz w:val="15"/>
           <w:lang w:val="en-US" w:eastAsia="en-US"/>
         </w:rPr>
-        <w:t>2ee9928dddb789f1f5fda3479ad86e0c0540deabbe3bf97c5ed82cb666479c84</w:t>
+        <w:t>Published with the GitHub Release asset</w:t>
       </w:r>
     </w:p>
     <w:p>
@@ -2526,7 +2526,7 @@
                 <w:sz w:val="17"/>
                 <w:lang w:val="en-US" w:eastAsia="en-US"/>
               </w:rPr>
-              <w:t>PyYAML 6.0.3; cryptography 46.0.4</w:t>
+              <w:t>PyYAML 6.0.3; cryptography 50.0.1</w:t>
             </w:r>
           </w:p>
         </w:tc>
@@ -2705,7 +2705,7 @@
               <w:rPr>
                 <w:lang w:val="en-US" w:eastAsia="en-US"/>
               </w:rPr>
-              <w:t>Directory-name note: The Stable ZIP is byte-for-byte identical to the validated RC2, so it still extracts to vapt-sanitize-v1.0.0-rc2/. The application itself still reports version 1.0.0.</w:t>
+              <w:t>Installation note: clone the public repository into vapt-sanitize and run ./scripts/install.sh. Release-asset checksums are published with the final GitHub Release.</w:t>
             </w:r>
           </w:p>
         </w:tc>
@@ -2752,7 +2752,7 @@
                 <w:sz w:val="17"/>
                 <w:lang w:val="en-US" w:eastAsia="en-US"/>
               </w:rPr>
-              <w:t>unzip vapt-sanitize-v1.0.0.zip</w:t>
+              <w:t>git clone https://github.com/Ghico/vapt-sanitize.git</w:t>
             </w:r>
             <w:r>
               <w:rPr>
@@ -2769,7 +2769,7 @@
                 <w:sz w:val="17"/>
                 <w:lang w:val="en-US" w:eastAsia="en-US"/>
               </w:rPr>
-              <w:t>cd vapt-sanitize-v1.0.0-rc2</w:t>
+              <w:t>cd vapt-sanitize</w:t>
             </w:r>
             <w:r>
               <w:rPr>
@@ -3035,7 +3035,7 @@
                 <w:sz w:val="17"/>
                 <w:lang w:val="en-US" w:eastAsia="en-US"/>
               </w:rPr>
-              <w:t>export VAPT_SANITIZE_HOME="$HOME/vapt-sanitize-v1.0.0-rc2"</w:t>
+              <w:t>export VAPT_SANITIZE_HOME="$HOME/vapt-sanitize"</w:t>
             </w:r>
             <w:r>
               <w:rPr>
@@ -5192,7 +5192,7 @@
                 <w:sz w:val="17"/>
                 <w:lang w:val="en-US" w:eastAsia="en-US"/>
               </w:rPr>
-              <w:t>export VAPT_SANITIZE_HOME="$HOME/vapt-sanitize-v1.0.0-rc2"</w:t>
+              <w:t>export VAPT_SANITIZE_HOME="$HOME/vapt-sanitize"</w:t>
             </w:r>
             <w:r>
               <w:rPr>
@@ -6608,7 +6608,7 @@
                 <w:sz w:val="17"/>
                 <w:lang w:val="en-US" w:eastAsia="en-US"/>
               </w:rPr>
-              <w:t>46.0.4</w:t>
+              <w:t>50.0.1</w:t>
             </w:r>
           </w:p>
         </w:tc>
@@ -6863,7 +6863,7 @@
                 <w:sz w:val="17"/>
                 <w:lang w:val="en-US" w:eastAsia="en-US"/>
               </w:rPr>
-              <w:t>SHA-256:</w:t>
+              <w:t>Checksum:</w:t>
             </w:r>
             <w:r>
               <w:rPr>
@@ -6880,7 +6880,7 @@
                 <w:sz w:val="17"/>
                 <w:lang w:val="en-US" w:eastAsia="en-US"/>
               </w:rPr>
-              <w:t>2ee9928dddb789f1f5fda3479ad86e0c0540deabbe3bf97c5ed82cb666479c84</w:t>
+              <w:t>Published with the GitHub Release asset</w:t>
             </w:r>
           </w:p>
         </w:tc>
@@ -6920,7 +6920,7 @@
               <w:rPr>
                 <w:lang w:val="en-US" w:eastAsia="en-US"/>
               </w:rPr>
-              <w:t>Golden baseline: Stable was promoted byte-for-byte from RC2 after it passed 181 tests, 10/10 auto-detection, and BUILD SUCCESSFUL. New functionality should start from a subsequent version without altering the v1.0.0 artifact.</w:t>
+              <w:t>Public baseline: v1.0.0 was validated with 181 tests, 10/10 auto-detection, cryptography 50.0.1, and BUILD SUCCESSFUL. Future functionality should start from a subsequent version.</w:t>
             </w:r>
           </w:p>
         </w:tc>

</xml_diff>